<commit_message>
feat: implement hardened resume ingestion pipeline
</commit_message>
<xml_diff>
--- a/fixtures/resumes/11-docx-resume.docx
+++ b/fixtures/resumes/11-docx-resume.docx
@@ -90,6 +90,11 @@
         </w:tc>
       </w:tr>
     </w:tbl>
+    <w:p>
+      <w:r>
+        <w:t xml:space="preserve">This synthetic fixture exists only to test deterministic local extraction, provenance offsets, and safe review behavior. This synthetic fixture exists only to test deterministic local extraction, provenance offsets, and safe review behavior. </w:t>
+      </w:r>
+    </w:p>
     <w:sectPr>
       <w:pgSz w:w="12240" w:h="15840"/>
       <w:pgMar w:top="1440" w:right="1800" w:bottom="1440" w:left="1800" w:header="720" w:footer="720" w:gutter="0"/>

</xml_diff>